<commit_message>
Sync manuscript to published Zenodo DOI
</commit_message>
<xml_diff>
--- a/paper/submission/F1000Research_Software_Tool_Article_v1.1.1.docx
+++ b/paper/submission/F1000Research_Software_Tool_Article_v1.1.1.docx
@@ -1312,7 +1312,7 @@
         <w:rPr>
           <w:lang w:val="en-GB"/>
         </w:rPr>
-        <w:t>Archived source code at time of publication: Tuyishime AP. SuRT-Virtual Rwanda: reproducibility artifact for district-level environmental-layer preparation and provenance labelling. Version 1.1.1. Zenodo. 2026. https://doi.org/10.5281/zenodo.21674910 [Software] [13].</w:t>
+        <w:t>Archived source code at time of publication: Tuyishime AP. SuRT-Virtual Rwanda: reproducibility artifact for district-level environmental-layer preparation and provenance labelling. Version 1.1.1. Zenodo. 2026. https://doi.org/10.5281/zenodo.21677162 [Software] [13].</w:t>
       </w:r>
     </w:p>
     <w:p>
@@ -1631,7 +1631,7 @@
         <w:rPr>
           <w:lang w:val="en-GB"/>
         </w:rPr>
-        <w:t>13. Tuyishime AP. SuRT-Virtual Rwanda: reproducibility artifact for district-level environmental-layer preparation and provenance labelling. Version 1.1.1. Zenodo. 2026. doi:10.5281/zenodo.21674910 [Software].</w:t>
+        <w:t>13. Tuyishime AP. SuRT-Virtual Rwanda: reproducibility artifact for district-level environmental-layer preparation and provenance labelling. Version 1.1.1. Zenodo. 2026. doi:10.5281/zenodo.21677162 [Software].</w:t>
       </w:r>
     </w:p>
     <w:p>
@@ -4131,7 +4131,7 @@
     <w:link w:val="Heading1Char"/>
     <w:uiPriority w:val="9"/>
     <w:qFormat/>
-    <w:rsid w:val="00067722"/>
+    <w:rsid w:val="00B729FC"/>
     <w:pPr>
       <w:keepNext/>
       <w:keepLines/>
@@ -4154,7 +4154,7 @@
     <w:uiPriority w:val="9"/>
     <w:unhideWhenUsed/>
     <w:qFormat/>
-    <w:rsid w:val="00067722"/>
+    <w:rsid w:val="00B729FC"/>
     <w:pPr>
       <w:keepNext/>
       <w:keepLines/>
@@ -4177,7 +4177,7 @@
     <w:uiPriority w:val="9"/>
     <w:unhideWhenUsed/>
     <w:qFormat/>
-    <w:rsid w:val="00067722"/>
+    <w:rsid w:val="00B729FC"/>
     <w:pPr>
       <w:keepNext/>
       <w:keepLines/>
@@ -4201,7 +4201,7 @@
     <w:semiHidden/>
     <w:unhideWhenUsed/>
     <w:qFormat/>
-    <w:rsid w:val="00067722"/>
+    <w:rsid w:val="00B729FC"/>
     <w:pPr>
       <w:keepNext/>
       <w:keepLines/>
@@ -4224,7 +4224,7 @@
     <w:semiHidden/>
     <w:unhideWhenUsed/>
     <w:qFormat/>
-    <w:rsid w:val="00067722"/>
+    <w:rsid w:val="00B729FC"/>
     <w:pPr>
       <w:keepNext/>
       <w:keepLines/>
@@ -4245,7 +4245,7 @@
     <w:semiHidden/>
     <w:unhideWhenUsed/>
     <w:qFormat/>
-    <w:rsid w:val="00067722"/>
+    <w:rsid w:val="00B729FC"/>
     <w:pPr>
       <w:keepNext/>
       <w:keepLines/>
@@ -4268,7 +4268,7 @@
     <w:semiHidden/>
     <w:unhideWhenUsed/>
     <w:qFormat/>
-    <w:rsid w:val="00067722"/>
+    <w:rsid w:val="00B729FC"/>
     <w:pPr>
       <w:keepNext/>
       <w:keepLines/>
@@ -4289,7 +4289,7 @@
     <w:semiHidden/>
     <w:unhideWhenUsed/>
     <w:qFormat/>
-    <w:rsid w:val="00067722"/>
+    <w:rsid w:val="00B729FC"/>
     <w:pPr>
       <w:keepNext/>
       <w:keepLines/>
@@ -4312,7 +4312,7 @@
     <w:semiHidden/>
     <w:unhideWhenUsed/>
     <w:qFormat/>
-    <w:rsid w:val="00067722"/>
+    <w:rsid w:val="00B729FC"/>
     <w:pPr>
       <w:keepNext/>
       <w:keepLines/>
@@ -4356,7 +4356,7 @@
     <w:basedOn w:val="DefaultParagraphFont"/>
     <w:link w:val="Heading1"/>
     <w:uiPriority w:val="9"/>
-    <w:rsid w:val="00067722"/>
+    <w:rsid w:val="00B729FC"/>
     <w:rPr>
       <w:rFonts w:ascii="Arial" w:eastAsiaTheme="majorEastAsia" w:hAnsi="Arial" w:cs="Arial"/>
       <w:b/>
@@ -4370,7 +4370,7 @@
     <w:basedOn w:val="DefaultParagraphFont"/>
     <w:link w:val="Heading2"/>
     <w:uiPriority w:val="9"/>
-    <w:rsid w:val="00067722"/>
+    <w:rsid w:val="00B729FC"/>
     <w:rPr>
       <w:rFonts w:ascii="Arial" w:eastAsiaTheme="majorEastAsia" w:hAnsi="Arial" w:cs="Arial"/>
       <w:b/>
@@ -4383,7 +4383,7 @@
     <w:basedOn w:val="DefaultParagraphFont"/>
     <w:link w:val="Heading3"/>
     <w:uiPriority w:val="9"/>
-    <w:rsid w:val="00067722"/>
+    <w:rsid w:val="00B729FC"/>
     <w:rPr>
       <w:rFonts w:ascii="Arial" w:eastAsiaTheme="majorEastAsia" w:hAnsi="Arial" w:cs="Arial"/>
       <w:b/>
@@ -4399,7 +4399,7 @@
     <w:link w:val="Heading4"/>
     <w:uiPriority w:val="9"/>
     <w:semiHidden/>
-    <w:rsid w:val="00067722"/>
+    <w:rsid w:val="00B729FC"/>
     <w:rPr>
       <w:rFonts w:eastAsiaTheme="majorEastAsia" w:cstheme="majorBidi"/>
       <w:i/>
@@ -4413,7 +4413,7 @@
     <w:link w:val="Heading5"/>
     <w:uiPriority w:val="9"/>
     <w:semiHidden/>
-    <w:rsid w:val="00067722"/>
+    <w:rsid w:val="00B729FC"/>
     <w:rPr>
       <w:rFonts w:eastAsiaTheme="majorEastAsia" w:cstheme="majorBidi"/>
       <w:color w:val="0F4761" w:themeColor="accent1" w:themeShade="BF"/>
@@ -4425,7 +4425,7 @@
     <w:link w:val="Heading6"/>
     <w:uiPriority w:val="9"/>
     <w:semiHidden/>
-    <w:rsid w:val="00067722"/>
+    <w:rsid w:val="00B729FC"/>
     <w:rPr>
       <w:rFonts w:eastAsiaTheme="majorEastAsia" w:cstheme="majorBidi"/>
       <w:i/>
@@ -4439,7 +4439,7 @@
     <w:link w:val="Heading7"/>
     <w:uiPriority w:val="9"/>
     <w:semiHidden/>
-    <w:rsid w:val="00067722"/>
+    <w:rsid w:val="00B729FC"/>
     <w:rPr>
       <w:rFonts w:eastAsiaTheme="majorEastAsia" w:cstheme="majorBidi"/>
       <w:color w:val="595959" w:themeColor="text1" w:themeTint="A6"/>
@@ -4451,7 +4451,7 @@
     <w:link w:val="Heading8"/>
     <w:uiPriority w:val="9"/>
     <w:semiHidden/>
-    <w:rsid w:val="00067722"/>
+    <w:rsid w:val="00B729FC"/>
     <w:rPr>
       <w:rFonts w:eastAsiaTheme="majorEastAsia" w:cstheme="majorBidi"/>
       <w:i/>
@@ -4465,7 +4465,7 @@
     <w:link w:val="Heading9"/>
     <w:uiPriority w:val="9"/>
     <w:semiHidden/>
-    <w:rsid w:val="00067722"/>
+    <w:rsid w:val="00B729FC"/>
     <w:rPr>
       <w:rFonts w:eastAsiaTheme="majorEastAsia" w:cstheme="majorBidi"/>
       <w:color w:val="272727" w:themeColor="text1" w:themeTint="D8"/>
@@ -4478,7 +4478,7 @@
     <w:link w:val="TitleChar"/>
     <w:uiPriority w:val="10"/>
     <w:qFormat/>
-    <w:rsid w:val="00067722"/>
+    <w:rsid w:val="00B729FC"/>
     <w:pPr>
       <w:keepNext/>
       <w:spacing w:after="240" w:line="240" w:lineRule="auto"/>
@@ -4499,7 +4499,7 @@
     <w:basedOn w:val="DefaultParagraphFont"/>
     <w:link w:val="Title"/>
     <w:uiPriority w:val="10"/>
-    <w:rsid w:val="00067722"/>
+    <w:rsid w:val="00B729FC"/>
     <w:rPr>
       <w:rFonts w:ascii="Arial" w:eastAsiaTheme="majorEastAsia" w:hAnsi="Arial" w:cs="Arial"/>
       <w:b/>
@@ -4517,7 +4517,7 @@
     <w:link w:val="SubtitleChar"/>
     <w:uiPriority w:val="11"/>
     <w:qFormat/>
-    <w:rsid w:val="00067722"/>
+    <w:rsid w:val="00B729FC"/>
     <w:pPr>
       <w:numPr>
         <w:ilvl w:val="1"/>
@@ -4536,7 +4536,7 @@
     <w:basedOn w:val="DefaultParagraphFont"/>
     <w:link w:val="Subtitle"/>
     <w:uiPriority w:val="11"/>
-    <w:rsid w:val="00067722"/>
+    <w:rsid w:val="00B729FC"/>
     <w:rPr>
       <w:rFonts w:eastAsiaTheme="majorEastAsia" w:cstheme="majorBidi"/>
       <w:color w:val="595959" w:themeColor="text1" w:themeTint="A6"/>
@@ -4552,7 +4552,7 @@
     <w:link w:val="QuoteChar"/>
     <w:uiPriority w:val="29"/>
     <w:qFormat/>
-    <w:rsid w:val="00067722"/>
+    <w:rsid w:val="00B729FC"/>
     <w:pPr>
       <w:spacing w:before="160"/>
       <w:jc w:val="center"/>
@@ -4568,7 +4568,7 @@
     <w:basedOn w:val="DefaultParagraphFont"/>
     <w:link w:val="Quote"/>
     <w:uiPriority w:val="29"/>
-    <w:rsid w:val="00067722"/>
+    <w:rsid w:val="00B729FC"/>
     <w:rPr>
       <w:i/>
       <w:iCs/>
@@ -4580,7 +4580,7 @@
     <w:basedOn w:val="Normal"/>
     <w:uiPriority w:val="34"/>
     <w:qFormat/>
-    <w:rsid w:val="00067722"/>
+    <w:rsid w:val="00B729FC"/>
     <w:pPr>
       <w:ind w:left="720"/>
       <w:contextualSpacing/>
@@ -4591,7 +4591,7 @@
     <w:basedOn w:val="DefaultParagraphFont"/>
     <w:uiPriority w:val="21"/>
     <w:qFormat/>
-    <w:rsid w:val="00067722"/>
+    <w:rsid w:val="00B729FC"/>
     <w:rPr>
       <w:i/>
       <w:iCs/>
@@ -4605,7 +4605,7 @@
     <w:link w:val="IntenseQuoteChar"/>
     <w:uiPriority w:val="30"/>
     <w:qFormat/>
-    <w:rsid w:val="00067722"/>
+    <w:rsid w:val="00B729FC"/>
     <w:pPr>
       <w:pBdr>
         <w:top w:val="single" w:sz="4" w:space="10" w:color="0F4761" w:themeColor="accent1" w:themeShade="BF"/>
@@ -4626,7 +4626,7 @@
     <w:basedOn w:val="DefaultParagraphFont"/>
     <w:link w:val="IntenseQuote"/>
     <w:uiPriority w:val="30"/>
-    <w:rsid w:val="00067722"/>
+    <w:rsid w:val="00B729FC"/>
     <w:rPr>
       <w:i/>
       <w:iCs/>
@@ -4638,7 +4638,7 @@
     <w:basedOn w:val="DefaultParagraphFont"/>
     <w:uiPriority w:val="32"/>
     <w:qFormat/>
-    <w:rsid w:val="00067722"/>
+    <w:rsid w:val="00B729FC"/>
     <w:rPr>
       <w:b/>
       <w:bCs/>
@@ -4651,7 +4651,7 @@
     <w:name w:val="Manuscript Code"/>
     <w:basedOn w:val="Normal"/>
     <w:link w:val="ManuscriptCodeChar"/>
-    <w:rsid w:val="00067722"/>
+    <w:rsid w:val="00B729FC"/>
     <w:pPr>
       <w:keepLines/>
       <w:shd w:val="clear" w:color="auto" w:fill="F2F2F2"/>
@@ -4667,7 +4667,7 @@
     <w:name w:val="Manuscript Code Char"/>
     <w:basedOn w:val="DefaultParagraphFont"/>
     <w:link w:val="ManuscriptCode"/>
-    <w:rsid w:val="00067722"/>
+    <w:rsid w:val="00B729FC"/>
     <w:rPr>
       <w:rFonts w:ascii="Consolas" w:hAnsi="Consolas" w:cs="Arial"/>
       <w:color w:val="000000"/>
@@ -4681,7 +4681,7 @@
     <w:link w:val="HeaderChar"/>
     <w:uiPriority w:val="99"/>
     <w:unhideWhenUsed/>
-    <w:rsid w:val="00067722"/>
+    <w:rsid w:val="00B729FC"/>
     <w:pPr>
       <w:tabs>
         <w:tab w:val="center" w:pos="4680"/>
@@ -4695,7 +4695,7 @@
     <w:basedOn w:val="DefaultParagraphFont"/>
     <w:link w:val="Header"/>
     <w:uiPriority w:val="99"/>
-    <w:rsid w:val="00067722"/>
+    <w:rsid w:val="00B729FC"/>
     <w:rPr>
       <w:rFonts w:ascii="Arial" w:hAnsi="Arial" w:cs="Arial"/>
       <w:color w:val="000000"/>
@@ -4708,7 +4708,7 @@
     <w:link w:val="FooterChar"/>
     <w:uiPriority w:val="99"/>
     <w:unhideWhenUsed/>
-    <w:rsid w:val="00067722"/>
+    <w:rsid w:val="00B729FC"/>
     <w:pPr>
       <w:tabs>
         <w:tab w:val="center" w:pos="4680"/>
@@ -4722,7 +4722,7 @@
     <w:basedOn w:val="DefaultParagraphFont"/>
     <w:link w:val="Footer"/>
     <w:uiPriority w:val="99"/>
-    <w:rsid w:val="00067722"/>
+    <w:rsid w:val="00B729FC"/>
     <w:rPr>
       <w:rFonts w:ascii="Arial" w:hAnsi="Arial" w:cs="Arial"/>
       <w:color w:val="000000"/>
@@ -4733,7 +4733,7 @@
     <w:name w:val="Table Grid"/>
     <w:basedOn w:val="TableNormal"/>
     <w:uiPriority w:val="39"/>
-    <w:rsid w:val="00067722"/>
+    <w:rsid w:val="00B729FC"/>
     <w:pPr>
       <w:spacing w:after="0" w:line="240" w:lineRule="auto"/>
     </w:pPr>

</xml_diff>

<commit_message>
Sync manuscript to published Zenodo DOI (#5)
</commit_message>
<xml_diff>
--- a/paper/submission/F1000Research_Software_Tool_Article_v1.1.1.docx
+++ b/paper/submission/F1000Research_Software_Tool_Article_v1.1.1.docx
@@ -1312,7 +1312,7 @@
         <w:rPr>
           <w:lang w:val="en-GB"/>
         </w:rPr>
-        <w:t>Archived source code at time of publication: Tuyishime AP. SuRT-Virtual Rwanda: reproducibility artifact for district-level environmental-layer preparation and provenance labelling. Version 1.1.1. Zenodo. 2026. https://doi.org/10.5281/zenodo.21674910 [Software] [13].</w:t>
+        <w:t>Archived source code at time of publication: Tuyishime AP. SuRT-Virtual Rwanda: reproducibility artifact for district-level environmental-layer preparation and provenance labelling. Version 1.1.1. Zenodo. 2026. https://doi.org/10.5281/zenodo.21677162 [Software] [13].</w:t>
       </w:r>
     </w:p>
     <w:p>
@@ -1631,7 +1631,7 @@
         <w:rPr>
           <w:lang w:val="en-GB"/>
         </w:rPr>
-        <w:t>13. Tuyishime AP. SuRT-Virtual Rwanda: reproducibility artifact for district-level environmental-layer preparation and provenance labelling. Version 1.1.1. Zenodo. 2026. doi:10.5281/zenodo.21674910 [Software].</w:t>
+        <w:t>13. Tuyishime AP. SuRT-Virtual Rwanda: reproducibility artifact for district-level environmental-layer preparation and provenance labelling. Version 1.1.1. Zenodo. 2026. doi:10.5281/zenodo.21677162 [Software].</w:t>
       </w:r>
     </w:p>
     <w:p>
@@ -4131,7 +4131,7 @@
     <w:link w:val="Heading1Char"/>
     <w:uiPriority w:val="9"/>
     <w:qFormat/>
-    <w:rsid w:val="00067722"/>
+    <w:rsid w:val="00B729FC"/>
     <w:pPr>
       <w:keepNext/>
       <w:keepLines/>
@@ -4154,7 +4154,7 @@
     <w:uiPriority w:val="9"/>
     <w:unhideWhenUsed/>
     <w:qFormat/>
-    <w:rsid w:val="00067722"/>
+    <w:rsid w:val="00B729FC"/>
     <w:pPr>
       <w:keepNext/>
       <w:keepLines/>
@@ -4177,7 +4177,7 @@
     <w:uiPriority w:val="9"/>
     <w:unhideWhenUsed/>
     <w:qFormat/>
-    <w:rsid w:val="00067722"/>
+    <w:rsid w:val="00B729FC"/>
     <w:pPr>
       <w:keepNext/>
       <w:keepLines/>
@@ -4201,7 +4201,7 @@
     <w:semiHidden/>
     <w:unhideWhenUsed/>
     <w:qFormat/>
-    <w:rsid w:val="00067722"/>
+    <w:rsid w:val="00B729FC"/>
     <w:pPr>
       <w:keepNext/>
       <w:keepLines/>
@@ -4224,7 +4224,7 @@
     <w:semiHidden/>
     <w:unhideWhenUsed/>
     <w:qFormat/>
-    <w:rsid w:val="00067722"/>
+    <w:rsid w:val="00B729FC"/>
     <w:pPr>
       <w:keepNext/>
       <w:keepLines/>
@@ -4245,7 +4245,7 @@
     <w:semiHidden/>
     <w:unhideWhenUsed/>
     <w:qFormat/>
-    <w:rsid w:val="00067722"/>
+    <w:rsid w:val="00B729FC"/>
     <w:pPr>
       <w:keepNext/>
       <w:keepLines/>
@@ -4268,7 +4268,7 @@
     <w:semiHidden/>
     <w:unhideWhenUsed/>
     <w:qFormat/>
-    <w:rsid w:val="00067722"/>
+    <w:rsid w:val="00B729FC"/>
     <w:pPr>
       <w:keepNext/>
       <w:keepLines/>
@@ -4289,7 +4289,7 @@
     <w:semiHidden/>
     <w:unhideWhenUsed/>
     <w:qFormat/>
-    <w:rsid w:val="00067722"/>
+    <w:rsid w:val="00B729FC"/>
     <w:pPr>
       <w:keepNext/>
       <w:keepLines/>
@@ -4312,7 +4312,7 @@
     <w:semiHidden/>
     <w:unhideWhenUsed/>
     <w:qFormat/>
-    <w:rsid w:val="00067722"/>
+    <w:rsid w:val="00B729FC"/>
     <w:pPr>
       <w:keepNext/>
       <w:keepLines/>
@@ -4356,7 +4356,7 @@
     <w:basedOn w:val="DefaultParagraphFont"/>
     <w:link w:val="Heading1"/>
     <w:uiPriority w:val="9"/>
-    <w:rsid w:val="00067722"/>
+    <w:rsid w:val="00B729FC"/>
     <w:rPr>
       <w:rFonts w:ascii="Arial" w:eastAsiaTheme="majorEastAsia" w:hAnsi="Arial" w:cs="Arial"/>
       <w:b/>
@@ -4370,7 +4370,7 @@
     <w:basedOn w:val="DefaultParagraphFont"/>
     <w:link w:val="Heading2"/>
     <w:uiPriority w:val="9"/>
-    <w:rsid w:val="00067722"/>
+    <w:rsid w:val="00B729FC"/>
     <w:rPr>
       <w:rFonts w:ascii="Arial" w:eastAsiaTheme="majorEastAsia" w:hAnsi="Arial" w:cs="Arial"/>
       <w:b/>
@@ -4383,7 +4383,7 @@
     <w:basedOn w:val="DefaultParagraphFont"/>
     <w:link w:val="Heading3"/>
     <w:uiPriority w:val="9"/>
-    <w:rsid w:val="00067722"/>
+    <w:rsid w:val="00B729FC"/>
     <w:rPr>
       <w:rFonts w:ascii="Arial" w:eastAsiaTheme="majorEastAsia" w:hAnsi="Arial" w:cs="Arial"/>
       <w:b/>
@@ -4399,7 +4399,7 @@
     <w:link w:val="Heading4"/>
     <w:uiPriority w:val="9"/>
     <w:semiHidden/>
-    <w:rsid w:val="00067722"/>
+    <w:rsid w:val="00B729FC"/>
     <w:rPr>
       <w:rFonts w:eastAsiaTheme="majorEastAsia" w:cstheme="majorBidi"/>
       <w:i/>
@@ -4413,7 +4413,7 @@
     <w:link w:val="Heading5"/>
     <w:uiPriority w:val="9"/>
     <w:semiHidden/>
-    <w:rsid w:val="00067722"/>
+    <w:rsid w:val="00B729FC"/>
     <w:rPr>
       <w:rFonts w:eastAsiaTheme="majorEastAsia" w:cstheme="majorBidi"/>
       <w:color w:val="0F4761" w:themeColor="accent1" w:themeShade="BF"/>
@@ -4425,7 +4425,7 @@
     <w:link w:val="Heading6"/>
     <w:uiPriority w:val="9"/>
     <w:semiHidden/>
-    <w:rsid w:val="00067722"/>
+    <w:rsid w:val="00B729FC"/>
     <w:rPr>
       <w:rFonts w:eastAsiaTheme="majorEastAsia" w:cstheme="majorBidi"/>
       <w:i/>
@@ -4439,7 +4439,7 @@
     <w:link w:val="Heading7"/>
     <w:uiPriority w:val="9"/>
     <w:semiHidden/>
-    <w:rsid w:val="00067722"/>
+    <w:rsid w:val="00B729FC"/>
     <w:rPr>
       <w:rFonts w:eastAsiaTheme="majorEastAsia" w:cstheme="majorBidi"/>
       <w:color w:val="595959" w:themeColor="text1" w:themeTint="A6"/>
@@ -4451,7 +4451,7 @@
     <w:link w:val="Heading8"/>
     <w:uiPriority w:val="9"/>
     <w:semiHidden/>
-    <w:rsid w:val="00067722"/>
+    <w:rsid w:val="00B729FC"/>
     <w:rPr>
       <w:rFonts w:eastAsiaTheme="majorEastAsia" w:cstheme="majorBidi"/>
       <w:i/>
@@ -4465,7 +4465,7 @@
     <w:link w:val="Heading9"/>
     <w:uiPriority w:val="9"/>
     <w:semiHidden/>
-    <w:rsid w:val="00067722"/>
+    <w:rsid w:val="00B729FC"/>
     <w:rPr>
       <w:rFonts w:eastAsiaTheme="majorEastAsia" w:cstheme="majorBidi"/>
       <w:color w:val="272727" w:themeColor="text1" w:themeTint="D8"/>
@@ -4478,7 +4478,7 @@
     <w:link w:val="TitleChar"/>
     <w:uiPriority w:val="10"/>
     <w:qFormat/>
-    <w:rsid w:val="00067722"/>
+    <w:rsid w:val="00B729FC"/>
     <w:pPr>
       <w:keepNext/>
       <w:spacing w:after="240" w:line="240" w:lineRule="auto"/>
@@ -4499,7 +4499,7 @@
     <w:basedOn w:val="DefaultParagraphFont"/>
     <w:link w:val="Title"/>
     <w:uiPriority w:val="10"/>
-    <w:rsid w:val="00067722"/>
+    <w:rsid w:val="00B729FC"/>
     <w:rPr>
       <w:rFonts w:ascii="Arial" w:eastAsiaTheme="majorEastAsia" w:hAnsi="Arial" w:cs="Arial"/>
       <w:b/>
@@ -4517,7 +4517,7 @@
     <w:link w:val="SubtitleChar"/>
     <w:uiPriority w:val="11"/>
     <w:qFormat/>
-    <w:rsid w:val="00067722"/>
+    <w:rsid w:val="00B729FC"/>
     <w:pPr>
       <w:numPr>
         <w:ilvl w:val="1"/>
@@ -4536,7 +4536,7 @@
     <w:basedOn w:val="DefaultParagraphFont"/>
     <w:link w:val="Subtitle"/>
     <w:uiPriority w:val="11"/>
-    <w:rsid w:val="00067722"/>
+    <w:rsid w:val="00B729FC"/>
     <w:rPr>
       <w:rFonts w:eastAsiaTheme="majorEastAsia" w:cstheme="majorBidi"/>
       <w:color w:val="595959" w:themeColor="text1" w:themeTint="A6"/>
@@ -4552,7 +4552,7 @@
     <w:link w:val="QuoteChar"/>
     <w:uiPriority w:val="29"/>
     <w:qFormat/>
-    <w:rsid w:val="00067722"/>
+    <w:rsid w:val="00B729FC"/>
     <w:pPr>
       <w:spacing w:before="160"/>
       <w:jc w:val="center"/>
@@ -4568,7 +4568,7 @@
     <w:basedOn w:val="DefaultParagraphFont"/>
     <w:link w:val="Quote"/>
     <w:uiPriority w:val="29"/>
-    <w:rsid w:val="00067722"/>
+    <w:rsid w:val="00B729FC"/>
     <w:rPr>
       <w:i/>
       <w:iCs/>
@@ -4580,7 +4580,7 @@
     <w:basedOn w:val="Normal"/>
     <w:uiPriority w:val="34"/>
     <w:qFormat/>
-    <w:rsid w:val="00067722"/>
+    <w:rsid w:val="00B729FC"/>
     <w:pPr>
       <w:ind w:left="720"/>
       <w:contextualSpacing/>
@@ -4591,7 +4591,7 @@
     <w:basedOn w:val="DefaultParagraphFont"/>
     <w:uiPriority w:val="21"/>
     <w:qFormat/>
-    <w:rsid w:val="00067722"/>
+    <w:rsid w:val="00B729FC"/>
     <w:rPr>
       <w:i/>
       <w:iCs/>
@@ -4605,7 +4605,7 @@
     <w:link w:val="IntenseQuoteChar"/>
     <w:uiPriority w:val="30"/>
     <w:qFormat/>
-    <w:rsid w:val="00067722"/>
+    <w:rsid w:val="00B729FC"/>
     <w:pPr>
       <w:pBdr>
         <w:top w:val="single" w:sz="4" w:space="10" w:color="0F4761" w:themeColor="accent1" w:themeShade="BF"/>
@@ -4626,7 +4626,7 @@
     <w:basedOn w:val="DefaultParagraphFont"/>
     <w:link w:val="IntenseQuote"/>
     <w:uiPriority w:val="30"/>
-    <w:rsid w:val="00067722"/>
+    <w:rsid w:val="00B729FC"/>
     <w:rPr>
       <w:i/>
       <w:iCs/>
@@ -4638,7 +4638,7 @@
     <w:basedOn w:val="DefaultParagraphFont"/>
     <w:uiPriority w:val="32"/>
     <w:qFormat/>
-    <w:rsid w:val="00067722"/>
+    <w:rsid w:val="00B729FC"/>
     <w:rPr>
       <w:b/>
       <w:bCs/>
@@ -4651,7 +4651,7 @@
     <w:name w:val="Manuscript Code"/>
     <w:basedOn w:val="Normal"/>
     <w:link w:val="ManuscriptCodeChar"/>
-    <w:rsid w:val="00067722"/>
+    <w:rsid w:val="00B729FC"/>
     <w:pPr>
       <w:keepLines/>
       <w:shd w:val="clear" w:color="auto" w:fill="F2F2F2"/>
@@ -4667,7 +4667,7 @@
     <w:name w:val="Manuscript Code Char"/>
     <w:basedOn w:val="DefaultParagraphFont"/>
     <w:link w:val="ManuscriptCode"/>
-    <w:rsid w:val="00067722"/>
+    <w:rsid w:val="00B729FC"/>
     <w:rPr>
       <w:rFonts w:ascii="Consolas" w:hAnsi="Consolas" w:cs="Arial"/>
       <w:color w:val="000000"/>
@@ -4681,7 +4681,7 @@
     <w:link w:val="HeaderChar"/>
     <w:uiPriority w:val="99"/>
     <w:unhideWhenUsed/>
-    <w:rsid w:val="00067722"/>
+    <w:rsid w:val="00B729FC"/>
     <w:pPr>
       <w:tabs>
         <w:tab w:val="center" w:pos="4680"/>
@@ -4695,7 +4695,7 @@
     <w:basedOn w:val="DefaultParagraphFont"/>
     <w:link w:val="Header"/>
     <w:uiPriority w:val="99"/>
-    <w:rsid w:val="00067722"/>
+    <w:rsid w:val="00B729FC"/>
     <w:rPr>
       <w:rFonts w:ascii="Arial" w:hAnsi="Arial" w:cs="Arial"/>
       <w:color w:val="000000"/>
@@ -4708,7 +4708,7 @@
     <w:link w:val="FooterChar"/>
     <w:uiPriority w:val="99"/>
     <w:unhideWhenUsed/>
-    <w:rsid w:val="00067722"/>
+    <w:rsid w:val="00B729FC"/>
     <w:pPr>
       <w:tabs>
         <w:tab w:val="center" w:pos="4680"/>
@@ -4722,7 +4722,7 @@
     <w:basedOn w:val="DefaultParagraphFont"/>
     <w:link w:val="Footer"/>
     <w:uiPriority w:val="99"/>
-    <w:rsid w:val="00067722"/>
+    <w:rsid w:val="00B729FC"/>
     <w:rPr>
       <w:rFonts w:ascii="Arial" w:hAnsi="Arial" w:cs="Arial"/>
       <w:color w:val="000000"/>
@@ -4733,7 +4733,7 @@
     <w:name w:val="Table Grid"/>
     <w:basedOn w:val="TableNormal"/>
     <w:uiPriority w:val="39"/>
-    <w:rsid w:val="00067722"/>
+    <w:rsid w:val="00B729FC"/>
     <w:pPr>
       <w:spacing w:after="0" w:line="240" w:lineRule="auto"/>
     </w:pPr>

</xml_diff>